<commit_message>
Update AIoT greenhouse prototype
</commit_message>
<xml_diff>
--- a/AIoT智慧温室种植系统项目介绍.docx
+++ b/AIoT智慧温室种植系统项目介绍.docx
@@ -45,11 +45,7 @@
         <w:jc w:val="both"/>
       </w:pPr>
       <w:r>
-        <w:rPr>
-          <w:rFonts w:ascii="Calibri" w:hAnsi="Calibri" w:eastAsia="Microsoft YaHei"/>
-          <w:sz w:val="22"/>
-        </w:rPr>
-        <w:t>本项目面向智慧农业和设施温室种植场景，针对传统温室环境监测不及时、人工调控依赖经验、病害发现滞后以及水电资源利用效率低等问题，设计并实现一套 AIoT 智慧温室种植系统。系统以多传感器实时采集为基础，接入温度、湿度、光照、土壤湿度、CO₂浓度、摄像头和执行设备状态，形成温室运行数据总览。在功能效果上，平台可展示实时曲线、历史趋势、异常报警、灌溉次数、节水率和节能率；当土壤湿度过低、温度过高或光照不足时，系统可自动联动滴灌水泵、排风风扇、LED补光灯和遮阳设备，实现“数据采集—智能分析—自动执行—反馈优化”的闭环控制。AI识别模块可对作物长势、叶片健康度和疑似病害风险进行分析，并生成处理建议，辅助管理者及时决策。在技术应用上，项目结合物联网通信、边缘感知、轻量化视觉识别和前端可视化技术，可进一步接入 YieldNet/YOLO 等作物识别模型，并通过 MQTT、HTTP 或 WebSocket 对接真实硬件。系统适用于校园实验温室、家庭种植、小型农业园区和设施农业示范场景，具有低成本、易部署、可扩展和便于竞赛展示的特点。</w:t>
+        <w:t>本项目面向智慧农业和设施温室答辩展示场景，当前成果定位为 React + TypeScript 前端演示原型。系统使用本地模拟数据展示温度、湿度、光照、土壤湿度和 CO₂ 趋势，并在同一模拟周期内计算控制目标、设备实际状态和报警。滴灌策略由统一配置管理：土壤湿度低于 36% 启动、高于 45% 停止，低于 34% 生成高风险告警。系统支持传感器离线、执行器控制失败、报警确认与恢复、页面刷新后的本地状态恢复。AI 页面使用诚实标注的演示识别适配器，用户明确选择健康、早期风险或严重风险场景，不根据文件名判断，也不声称已运行 YOLO 或 YieldNet。</w:t>
       </w:r>
     </w:p>
     <w:p>
@@ -66,11 +62,7 @@
         <w:jc w:val="both"/>
       </w:pPr>
       <w:r>
-        <w:rPr>
-          <w:rFonts w:ascii="Calibri" w:hAnsi="Calibri" w:eastAsia="Microsoft YaHei"/>
-          <w:sz w:val="21"/>
-        </w:rPr>
-        <w:t>传统温室管理依赖人工巡检和经验调控，容易错过环境异常和病害早期信号。本项目通过 AI 与 IoT 技术提升温室管理的实时性、准确性和自动化水平。</w:t>
+        <w:t>传统温室管理依赖人工巡检和经验调控。本项目先以可运行、可测试、可解释的前端原型验证数据、策略、设备与报警闭环，为后续真实硬件和模型接入提供界面与状态模型基础。</w:t>
       </w:r>
     </w:p>
     <w:p>
@@ -87,11 +79,7 @@
         <w:jc w:val="both"/>
       </w:pPr>
       <w:r>
-        <w:rPr>
-          <w:rFonts w:ascii="Calibri" w:hAnsi="Calibri" w:eastAsia="Microsoft YaHei"/>
-          <w:sz w:val="21"/>
-        </w:rPr>
-        <w:t>系统可完成环境监测、数据大屏、智能控制、AI识别、异常预警、设备管理和项目展示，能够在无真实硬件条件下用模拟数据完整演示业务流程。</w:t>
+        <w:t>系统已实现数据总览、环境监测、自动/手动控制、AI 演示识别、报警生命周期、设备离线演示、本地持久化和项目介绍。节水率和节能率基于模拟基线、运行时长和模拟功率估算，样本不足时不显示百分比。项目可在无真实硬件的条件下完整演示业务流，但不将模拟数据表述为现场测量结果。</w:t>
       </w:r>
     </w:p>
     <w:p>
@@ -108,11 +96,38 @@
         <w:jc w:val="both"/>
       </w:pPr>
       <w:r>
-        <w:rPr>
-          <w:rFonts w:ascii="Calibri" w:hAnsi="Calibri" w:eastAsia="Microsoft YaHei"/>
-          <w:sz w:val="21"/>
-        </w:rPr>
-        <w:t>后续可接入真实传感器、摄像头、边缘计算设备和自动控制器，将模拟识别结果替换为真实 AI 模型推理结果，逐步形成可落地的智慧农业控制平台。</w:t>
+        <w:t>未来可接入真实传感器、摄像头、MQTT/HTTP/WebSocket 数据通道、后端数据库、边缘计算设备和自动控制器，并将 DemoRecognitionAdapter 替换为真实 HTTP 推理适配器。上述能力均为预留接口或未来规划，当前版本尚未实现。</w:t>
+      </w:r>
+    </w:p>
+    <w:p>
+      <w:pPr>
+        <w:pStyle w:val="Heading2"/>
+      </w:pPr>
+      <w:r>
+        <w:t>已实现与未实现</w:t>
+      </w:r>
+    </w:p>
+    <w:p>
+      <w:r>
+        <w:t>已实现：前端可视化、传感器数据模拟、回差控制策略、目标/实际设备状态、离线闭环、报警去重与恢复、AI 演示适配器、本地状态恢复和自动化测试。</w:t>
+      </w:r>
+    </w:p>
+    <w:p>
+      <w:r>
+        <w:t>未实现：真实传感器、MQTT、WebSocket、后端数据库、云端同步、YOLO/YieldNet 推理服务、真实控制器和现场水电计量。</w:t>
+      </w:r>
+    </w:p>
+    <w:p>
+      <w:pPr>
+        <w:pStyle w:val="Heading2"/>
+      </w:pPr>
+      <w:r>
+        <w:t>演示数据口径</w:t>
+      </w:r>
+    </w:p>
+    <w:p>
+      <w:r>
+        <w:t>节水率 =（模拟基线灌溉时长 - 策略实际运行时长）÷ 模拟基线灌溉时长。节能率使用水泵、风扇、补光灯和遮阳设备的模拟功率与运行时长估算。两项指标仅用于演示策略可解释性，不代表现场测量结果。</w:t>
       </w:r>
     </w:p>
     <w:sectPr>

</xml_diff>